<commit_message>
ech-0293: Inline-Code im Fliesstext von 8pt auf 11pt
Gleicher Eingriff wie in ech-0294: VerbatimChar hing an BeschriftungZchn und
lief damit auf 8pt, waehrend der Body 12pt fuehrt. Die Vorlage bringt neu die
31 Syntax-Token-Stile selbst mit, auf sz 16 festgenagelt, damit die
Beispielbloecke ihre Groesse behalten -- sie sind basedOn VerbatimChar und
waeren sonst mitgewachsen.

Geprueft am gebauten Dokument: 137 Inline-Vorkommen auf sz 22, 5694 Block-Runs
unveraendert auf sz 16.
</commit_message>
<xml_diff>
--- a/ech-0293_operations/input/template.docx
+++ b/ech-0293_operations/input/template.docx
@@ -2513,7 +2513,8 @@
     <w:basedOn w:val="BeschriftungZchn"/>
     <w:rPr>
       <w:rFonts w:ascii="Consolas" w:hAnsi="Consolas"/>
-      <w:sz w:val="16"/>
+      <w:sz w:val="22"/>
+      <w:szCs w:val="22"/>
     </w:rPr>
   </w:style>
   <w:style w:type="character" w:customStyle="1" w:styleId="SectionNumber">
@@ -2655,6 +2656,305 @@
       <w:numPr>
         <w:numId w:val="6"/>
       </w:numPr>
+    </w:pPr>
+  </w:style>
+  <w:style w:type="character" w:customStyle="1" w:styleId="KeywordTok">
+    <w:name w:val="KeywordTok"/>
+    <w:basedOn w:val="VerbatimChar"/>
+    <w:rPr>
+      <w:sz w:val="16"/>
+      <w:szCs w:val="16"/>
+      <w:b/>
+      <w:color w:val="007020"/>
+    </w:rPr>
+  </w:style>
+  <w:style w:type="character" w:customStyle="1" w:styleId="DataTypeTok">
+    <w:name w:val="DataTypeTok"/>
+    <w:basedOn w:val="VerbatimChar"/>
+    <w:rPr>
+      <w:sz w:val="16"/>
+      <w:szCs w:val="16"/>
+      <w:color w:val="902000"/>
+    </w:rPr>
+  </w:style>
+  <w:style w:type="character" w:customStyle="1" w:styleId="DecValTok">
+    <w:name w:val="DecValTok"/>
+    <w:basedOn w:val="VerbatimChar"/>
+    <w:rPr>
+      <w:sz w:val="16"/>
+      <w:szCs w:val="16"/>
+      <w:color w:val="40a070"/>
+    </w:rPr>
+  </w:style>
+  <w:style w:type="character" w:customStyle="1" w:styleId="BaseNTok">
+    <w:name w:val="BaseNTok"/>
+    <w:basedOn w:val="VerbatimChar"/>
+    <w:rPr>
+      <w:sz w:val="16"/>
+      <w:szCs w:val="16"/>
+      <w:color w:val="40a070"/>
+    </w:rPr>
+  </w:style>
+  <w:style w:type="character" w:customStyle="1" w:styleId="FloatTok">
+    <w:name w:val="FloatTok"/>
+    <w:basedOn w:val="VerbatimChar"/>
+    <w:rPr>
+      <w:sz w:val="16"/>
+      <w:szCs w:val="16"/>
+      <w:color w:val="40a070"/>
+    </w:rPr>
+  </w:style>
+  <w:style w:type="character" w:customStyle="1" w:styleId="ConstantTok">
+    <w:name w:val="ConstantTok"/>
+    <w:basedOn w:val="VerbatimChar"/>
+    <w:rPr>
+      <w:sz w:val="16"/>
+      <w:szCs w:val="16"/>
+      <w:color w:val="880000"/>
+    </w:rPr>
+  </w:style>
+  <w:style w:type="character" w:customStyle="1" w:styleId="CharTok">
+    <w:name w:val="CharTok"/>
+    <w:basedOn w:val="VerbatimChar"/>
+    <w:rPr>
+      <w:sz w:val="16"/>
+      <w:szCs w:val="16"/>
+      <w:color w:val="4070a0"/>
+    </w:rPr>
+  </w:style>
+  <w:style w:type="character" w:customStyle="1" w:styleId="SpecialCharTok">
+    <w:name w:val="SpecialCharTok"/>
+    <w:basedOn w:val="VerbatimChar"/>
+    <w:rPr>
+      <w:sz w:val="16"/>
+      <w:szCs w:val="16"/>
+      <w:color w:val="4070a0"/>
+    </w:rPr>
+  </w:style>
+  <w:style w:type="character" w:customStyle="1" w:styleId="StringTok">
+    <w:name w:val="StringTok"/>
+    <w:basedOn w:val="VerbatimChar"/>
+    <w:rPr>
+      <w:sz w:val="16"/>
+      <w:szCs w:val="16"/>
+      <w:color w:val="4070a0"/>
+    </w:rPr>
+  </w:style>
+  <w:style w:type="character" w:customStyle="1" w:styleId="VerbatimStringTok">
+    <w:name w:val="VerbatimStringTok"/>
+    <w:basedOn w:val="VerbatimChar"/>
+    <w:rPr>
+      <w:sz w:val="16"/>
+      <w:szCs w:val="16"/>
+      <w:color w:val="4070a0"/>
+    </w:rPr>
+  </w:style>
+  <w:style w:type="character" w:customStyle="1" w:styleId="SpecialStringTok">
+    <w:name w:val="SpecialStringTok"/>
+    <w:basedOn w:val="VerbatimChar"/>
+    <w:rPr>
+      <w:sz w:val="16"/>
+      <w:szCs w:val="16"/>
+      <w:color w:val="bb6688"/>
+    </w:rPr>
+  </w:style>
+  <w:style w:type="character" w:customStyle="1" w:styleId="ImportTok">
+    <w:name w:val="ImportTok"/>
+    <w:basedOn w:val="VerbatimChar"/>
+    <w:rPr>
+      <w:sz w:val="16"/>
+      <w:szCs w:val="16"/>
+      <w:b/>
+      <w:color w:val="008000"/>
+    </w:rPr>
+  </w:style>
+  <w:style w:type="character" w:customStyle="1" w:styleId="CommentTok">
+    <w:name w:val="CommentTok"/>
+    <w:basedOn w:val="VerbatimChar"/>
+    <w:rPr>
+      <w:sz w:val="16"/>
+      <w:szCs w:val="16"/>
+      <w:i/>
+      <w:color w:val="60a0b0"/>
+    </w:rPr>
+  </w:style>
+  <w:style w:type="character" w:customStyle="1" w:styleId="DocumentationTok">
+    <w:name w:val="DocumentationTok"/>
+    <w:basedOn w:val="VerbatimChar"/>
+    <w:rPr>
+      <w:sz w:val="16"/>
+      <w:szCs w:val="16"/>
+      <w:i/>
+      <w:color w:val="ba2121"/>
+    </w:rPr>
+  </w:style>
+  <w:style w:type="character" w:customStyle="1" w:styleId="AnnotationTok">
+    <w:name w:val="AnnotationTok"/>
+    <w:basedOn w:val="VerbatimChar"/>
+    <w:rPr>
+      <w:sz w:val="16"/>
+      <w:szCs w:val="16"/>
+      <w:b/>
+      <w:i/>
+      <w:color w:val="60a0b0"/>
+    </w:rPr>
+  </w:style>
+  <w:style w:type="character" w:customStyle="1" w:styleId="CommentVarTok">
+    <w:name w:val="CommentVarTok"/>
+    <w:basedOn w:val="VerbatimChar"/>
+    <w:rPr>
+      <w:sz w:val="16"/>
+      <w:szCs w:val="16"/>
+      <w:b/>
+      <w:i/>
+      <w:color w:val="60a0b0"/>
+    </w:rPr>
+  </w:style>
+  <w:style w:type="character" w:customStyle="1" w:styleId="OtherTok">
+    <w:name w:val="OtherTok"/>
+    <w:basedOn w:val="VerbatimChar"/>
+    <w:rPr>
+      <w:sz w:val="16"/>
+      <w:szCs w:val="16"/>
+      <w:color w:val="007020"/>
+    </w:rPr>
+  </w:style>
+  <w:style w:type="character" w:customStyle="1" w:styleId="FunctionTok">
+    <w:name w:val="FunctionTok"/>
+    <w:basedOn w:val="VerbatimChar"/>
+    <w:rPr>
+      <w:sz w:val="16"/>
+      <w:szCs w:val="16"/>
+      <w:color w:val="06287e"/>
+    </w:rPr>
+  </w:style>
+  <w:style w:type="character" w:customStyle="1" w:styleId="VariableTok">
+    <w:name w:val="VariableTok"/>
+    <w:basedOn w:val="VerbatimChar"/>
+    <w:rPr>
+      <w:sz w:val="16"/>
+      <w:szCs w:val="16"/>
+      <w:color w:val="19177c"/>
+    </w:rPr>
+  </w:style>
+  <w:style w:type="character" w:customStyle="1" w:styleId="ControlFlowTok">
+    <w:name w:val="ControlFlowTok"/>
+    <w:basedOn w:val="VerbatimChar"/>
+    <w:rPr>
+      <w:sz w:val="16"/>
+      <w:szCs w:val="16"/>
+      <w:b/>
+      <w:color w:val="007020"/>
+    </w:rPr>
+  </w:style>
+  <w:style w:type="character" w:customStyle="1" w:styleId="OperatorTok">
+    <w:name w:val="OperatorTok"/>
+    <w:basedOn w:val="VerbatimChar"/>
+    <w:rPr>
+      <w:sz w:val="16"/>
+      <w:szCs w:val="16"/>
+      <w:color w:val="666666"/>
+    </w:rPr>
+  </w:style>
+  <w:style w:type="character" w:customStyle="1" w:styleId="BuiltInTok">
+    <w:name w:val="BuiltInTok"/>
+    <w:basedOn w:val="VerbatimChar"/>
+    <w:rPr>
+      <w:sz w:val="16"/>
+      <w:szCs w:val="16"/>
+      <w:color w:val="008000"/>
+    </w:rPr>
+  </w:style>
+  <w:style w:type="character" w:customStyle="1" w:styleId="ExtensionTok">
+    <w:name w:val="ExtensionTok"/>
+    <w:basedOn w:val="VerbatimChar"/>
+    <w:rPr>
+      <w:sz w:val="16"/>
+      <w:szCs w:val="16"/>
+    </w:rPr>
+  </w:style>
+  <w:style w:type="character" w:customStyle="1" w:styleId="PreprocessorTok">
+    <w:name w:val="PreprocessorTok"/>
+    <w:basedOn w:val="VerbatimChar"/>
+    <w:rPr>
+      <w:sz w:val="16"/>
+      <w:szCs w:val="16"/>
+      <w:color w:val="bc7a00"/>
+    </w:rPr>
+  </w:style>
+  <w:style w:type="character" w:customStyle="1" w:styleId="AttributeTok">
+    <w:name w:val="AttributeTok"/>
+    <w:basedOn w:val="VerbatimChar"/>
+    <w:rPr>
+      <w:sz w:val="16"/>
+      <w:szCs w:val="16"/>
+      <w:color w:val="7d9029"/>
+    </w:rPr>
+  </w:style>
+  <w:style w:type="character" w:customStyle="1" w:styleId="RegionMarkerTok">
+    <w:name w:val="RegionMarkerTok"/>
+    <w:basedOn w:val="VerbatimChar"/>
+    <w:rPr>
+      <w:sz w:val="16"/>
+      <w:szCs w:val="16"/>
+    </w:rPr>
+  </w:style>
+  <w:style w:type="character" w:customStyle="1" w:styleId="InformationTok">
+    <w:name w:val="InformationTok"/>
+    <w:basedOn w:val="VerbatimChar"/>
+    <w:rPr>
+      <w:sz w:val="16"/>
+      <w:szCs w:val="16"/>
+      <w:b/>
+      <w:i/>
+      <w:color w:val="60a0b0"/>
+    </w:rPr>
+  </w:style>
+  <w:style w:type="character" w:customStyle="1" w:styleId="WarningTok">
+    <w:name w:val="WarningTok"/>
+    <w:basedOn w:val="VerbatimChar"/>
+    <w:rPr>
+      <w:sz w:val="16"/>
+      <w:szCs w:val="16"/>
+      <w:b/>
+      <w:i/>
+      <w:color w:val="60a0b0"/>
+    </w:rPr>
+  </w:style>
+  <w:style w:type="character" w:customStyle="1" w:styleId="AlertTok">
+    <w:name w:val="AlertTok"/>
+    <w:basedOn w:val="VerbatimChar"/>
+    <w:rPr>
+      <w:sz w:val="16"/>
+      <w:szCs w:val="16"/>
+      <w:b/>
+      <w:color w:val="ff0000"/>
+    </w:rPr>
+  </w:style>
+  <w:style w:type="character" w:customStyle="1" w:styleId="ErrorTok">
+    <w:name w:val="ErrorTok"/>
+    <w:basedOn w:val="VerbatimChar"/>
+    <w:rPr>
+      <w:sz w:val="16"/>
+      <w:szCs w:val="16"/>
+      <w:b/>
+      <w:color w:val="ff0000"/>
+    </w:rPr>
+  </w:style>
+  <w:style w:type="character" w:customStyle="1" w:styleId="NormalTok">
+    <w:name w:val="NormalTok"/>
+    <w:basedOn w:val="VerbatimChar"/>
+    <w:rPr>
+      <w:sz w:val="16"/>
+      <w:szCs w:val="16"/>
+    </w:rPr>
+  </w:style>
+  <w:style w:type="paragraph" w:customStyle="1" w:styleId="SourceCode">
+    <w:name w:val="Source Code"/>
+    <w:basedOn w:val="Normal"/>
+    <w:link w:val="VerbatimChar"/>
+    <w:pPr>
+      <w:wordWrap w:val="off"/>
     </w:pPr>
   </w:style>
 </w:styles>

</xml_diff>